<commit_message>
docs: state why the INT8 classifier comparison is not on the published split
Correction to commit e27b7a3: it said the classifier's normal-road Kaggle
images were missing without an API key. They were never missing - a
Kaggle re-ingest found every image already present. The real cause is
that the DNIT crops were regenerated, so the grouped split no longer
exactly matches the one the shipped head was trained on and the absolute
93.4% may include training images. The FP32-vs-INT8 difference, measured
on identical images, is unaffected. Report and alignment doc now say so.

Co-Authored-By: Claude Opus 5.5 <noreply@anthropic.com>
</commit_message>
<xml_diff>
--- a/docs/CSET485_ROAD_SHIELD_Milestone3_Report_Draft.docx
+++ b/docs/CSET485_ROAD_SHIELD_Milestone3_Report_Draft.docx
@@ -112,7 +112,7 @@
     <w:sdt>
       <w:sdtPr>
         <w:alias w:val="Contents"/>
-        <w:id w:val="853303216"/>
+        <w:id w:val="-1809078898"/>
       </w:sdtPr>
       <w:sdtEndPr/>
       <w:sdtContent>
@@ -139,7 +139,7 @@
           <w:r>
             <w:fldChar w:fldCharType="separate"/>
           </w:r>
-          <w:hyperlink w:anchor="_Toc241697842" w:history="1">
+          <w:hyperlink w:anchor="_Toc241701015" w:history="1">
             <w:r>
               <w:rPr>
                 <w:rStyle w:val="Hyperlink"/>
@@ -163,7 +163,7 @@
               <w:rPr>
                 <w:noProof/>
               </w:rPr>
-              <w:instrText xml:space="preserve"> PAGEREF _Toc241697842 \h </w:instrText>
+              <w:instrText xml:space="preserve"> PAGEREF _Toc241701015 \h </w:instrText>
             </w:r>
             <w:r>
               <w:rPr>
@@ -201,7 +201,7 @@
               <w:noProof/>
             </w:rPr>
           </w:pPr>
-          <w:hyperlink w:anchor="_Toc241697843" w:history="1">
+          <w:hyperlink w:anchor="_Toc241701016" w:history="1">
             <w:r>
               <w:rPr>
                 <w:rStyle w:val="Hyperlink"/>
@@ -225,7 +225,7 @@
               <w:rPr>
                 <w:noProof/>
               </w:rPr>
-              <w:instrText xml:space="preserve"> PAGEREF _Toc241697843 \h </w:instrText>
+              <w:instrText xml:space="preserve"> PAGEREF _Toc241701016 \h </w:instrText>
             </w:r>
             <w:r>
               <w:rPr>
@@ -263,7 +263,7 @@
               <w:noProof/>
             </w:rPr>
           </w:pPr>
-          <w:hyperlink w:anchor="_Toc241697844" w:history="1">
+          <w:hyperlink w:anchor="_Toc241701017" w:history="1">
             <w:r>
               <w:rPr>
                 <w:rStyle w:val="Hyperlink"/>
@@ -287,7 +287,7 @@
               <w:rPr>
                 <w:noProof/>
               </w:rPr>
-              <w:instrText xml:space="preserve"> PAGEREF _Toc241697844 \h </w:instrText>
+              <w:instrText xml:space="preserve"> PAGEREF _Toc241701017 \h </w:instrText>
             </w:r>
             <w:r>
               <w:rPr>
@@ -325,7 +325,7 @@
               <w:noProof/>
             </w:rPr>
           </w:pPr>
-          <w:hyperlink w:anchor="_Toc241697845" w:history="1">
+          <w:hyperlink w:anchor="_Toc241701018" w:history="1">
             <w:r>
               <w:rPr>
                 <w:rStyle w:val="Hyperlink"/>
@@ -349,7 +349,7 @@
               <w:rPr>
                 <w:noProof/>
               </w:rPr>
-              <w:instrText xml:space="preserve"> PAGEREF _Toc241697845 \h </w:instrText>
+              <w:instrText xml:space="preserve"> PAGEREF _Toc241701018 \h </w:instrText>
             </w:r>
             <w:r>
               <w:rPr>
@@ -387,7 +387,7 @@
               <w:noProof/>
             </w:rPr>
           </w:pPr>
-          <w:hyperlink w:anchor="_Toc241697846" w:history="1">
+          <w:hyperlink w:anchor="_Toc241701019" w:history="1">
             <w:r>
               <w:rPr>
                 <w:rStyle w:val="Hyperlink"/>
@@ -411,7 +411,7 @@
               <w:rPr>
                 <w:noProof/>
               </w:rPr>
-              <w:instrText xml:space="preserve"> PAGEREF _Toc241697846 \h </w:instrText>
+              <w:instrText xml:space="preserve"> PAGEREF _Toc241701019 \h </w:instrText>
             </w:r>
             <w:r>
               <w:rPr>
@@ -449,7 +449,7 @@
               <w:noProof/>
             </w:rPr>
           </w:pPr>
-          <w:hyperlink w:anchor="_Toc241697847" w:history="1">
+          <w:hyperlink w:anchor="_Toc241701020" w:history="1">
             <w:r>
               <w:rPr>
                 <w:rStyle w:val="Hyperlink"/>
@@ -473,7 +473,7 @@
               <w:rPr>
                 <w:noProof/>
               </w:rPr>
-              <w:instrText xml:space="preserve"> PAGEREF _Toc241697847 \h </w:instrText>
+              <w:instrText xml:space="preserve"> PAGEREF _Toc241701020 \h </w:instrText>
             </w:r>
             <w:r>
               <w:rPr>
@@ -511,7 +511,7 @@
               <w:noProof/>
             </w:rPr>
           </w:pPr>
-          <w:hyperlink w:anchor="_Toc241697848" w:history="1">
+          <w:hyperlink w:anchor="_Toc241701021" w:history="1">
             <w:r>
               <w:rPr>
                 <w:rStyle w:val="Hyperlink"/>
@@ -535,7 +535,7 @@
               <w:rPr>
                 <w:noProof/>
               </w:rPr>
-              <w:instrText xml:space="preserve"> PAGEREF _Toc241697848 \h </w:instrText>
+              <w:instrText xml:space="preserve"> PAGEREF _Toc241701021 \h </w:instrText>
             </w:r>
             <w:r>
               <w:rPr>
@@ -573,7 +573,7 @@
               <w:noProof/>
             </w:rPr>
           </w:pPr>
-          <w:hyperlink w:anchor="_Toc241697849" w:history="1">
+          <w:hyperlink w:anchor="_Toc241701022" w:history="1">
             <w:r>
               <w:rPr>
                 <w:rStyle w:val="Hyperlink"/>
@@ -597,7 +597,7 @@
               <w:rPr>
                 <w:noProof/>
               </w:rPr>
-              <w:instrText xml:space="preserve"> PAGEREF _Toc241697849 \h </w:instrText>
+              <w:instrText xml:space="preserve"> PAGEREF _Toc241701022 \h </w:instrText>
             </w:r>
             <w:r>
               <w:rPr>
@@ -635,7 +635,7 @@
               <w:noProof/>
             </w:rPr>
           </w:pPr>
-          <w:hyperlink w:anchor="_Toc241697850" w:history="1">
+          <w:hyperlink w:anchor="_Toc241701023" w:history="1">
             <w:r>
               <w:rPr>
                 <w:rStyle w:val="Hyperlink"/>
@@ -659,7 +659,7 @@
               <w:rPr>
                 <w:noProof/>
               </w:rPr>
-              <w:instrText xml:space="preserve"> PAGEREF _Toc241697850 \h </w:instrText>
+              <w:instrText xml:space="preserve"> PAGEREF _Toc241701023 \h </w:instrText>
             </w:r>
             <w:r>
               <w:rPr>
@@ -697,7 +697,7 @@
               <w:noProof/>
             </w:rPr>
           </w:pPr>
-          <w:hyperlink w:anchor="_Toc241697851" w:history="1">
+          <w:hyperlink w:anchor="_Toc241701024" w:history="1">
             <w:r>
               <w:rPr>
                 <w:rStyle w:val="Hyperlink"/>
@@ -721,7 +721,7 @@
               <w:rPr>
                 <w:noProof/>
               </w:rPr>
-              <w:instrText xml:space="preserve"> PAGEREF _Toc241697851 \h </w:instrText>
+              <w:instrText xml:space="preserve"> PAGEREF _Toc241701024 \h </w:instrText>
             </w:r>
             <w:r>
               <w:rPr>
@@ -759,7 +759,7 @@
               <w:noProof/>
             </w:rPr>
           </w:pPr>
-          <w:hyperlink w:anchor="_Toc241697852" w:history="1">
+          <w:hyperlink w:anchor="_Toc241701025" w:history="1">
             <w:r>
               <w:rPr>
                 <w:rStyle w:val="Hyperlink"/>
@@ -783,7 +783,7 @@
               <w:rPr>
                 <w:noProof/>
               </w:rPr>
-              <w:instrText xml:space="preserve"> PAGEREF _Toc241697852 \h </w:instrText>
+              <w:instrText xml:space="preserve"> PAGEREF _Toc241701025 \h </w:instrText>
             </w:r>
             <w:r>
               <w:rPr>
@@ -821,7 +821,7 @@
               <w:noProof/>
             </w:rPr>
           </w:pPr>
-          <w:hyperlink w:anchor="_Toc241697853" w:history="1">
+          <w:hyperlink w:anchor="_Toc241701026" w:history="1">
             <w:r>
               <w:rPr>
                 <w:rStyle w:val="Hyperlink"/>
@@ -845,7 +845,7 @@
               <w:rPr>
                 <w:noProof/>
               </w:rPr>
-              <w:instrText xml:space="preserve"> PAGEREF _Toc241697853 \h </w:instrText>
+              <w:instrText xml:space="preserve"> PAGEREF _Toc241701026 \h </w:instrText>
             </w:r>
             <w:r>
               <w:rPr>
@@ -883,7 +883,7 @@
               <w:noProof/>
             </w:rPr>
           </w:pPr>
-          <w:hyperlink w:anchor="_Toc241697854" w:history="1">
+          <w:hyperlink w:anchor="_Toc241701027" w:history="1">
             <w:r>
               <w:rPr>
                 <w:rStyle w:val="Hyperlink"/>
@@ -907,7 +907,7 @@
               <w:rPr>
                 <w:noProof/>
               </w:rPr>
-              <w:instrText xml:space="preserve"> PAGEREF _Toc241697854 \h </w:instrText>
+              <w:instrText xml:space="preserve"> PAGEREF _Toc241701027 \h </w:instrText>
             </w:r>
             <w:r>
               <w:rPr>
@@ -945,7 +945,7 @@
               <w:noProof/>
             </w:rPr>
           </w:pPr>
-          <w:hyperlink w:anchor="_Toc241697855" w:history="1">
+          <w:hyperlink w:anchor="_Toc241701028" w:history="1">
             <w:r>
               <w:rPr>
                 <w:rStyle w:val="Hyperlink"/>
@@ -969,7 +969,7 @@
               <w:rPr>
                 <w:noProof/>
               </w:rPr>
-              <w:instrText xml:space="preserve"> PAGEREF _Toc241697855 \h </w:instrText>
+              <w:instrText xml:space="preserve"> PAGEREF _Toc241701028 \h </w:instrText>
             </w:r>
             <w:r>
               <w:rPr>
@@ -1007,7 +1007,7 @@
               <w:noProof/>
             </w:rPr>
           </w:pPr>
-          <w:hyperlink w:anchor="_Toc241697856" w:history="1">
+          <w:hyperlink w:anchor="_Toc241701029" w:history="1">
             <w:r>
               <w:rPr>
                 <w:rStyle w:val="Hyperlink"/>
@@ -1031,7 +1031,7 @@
               <w:rPr>
                 <w:noProof/>
               </w:rPr>
-              <w:instrText xml:space="preserve"> PAGEREF _Toc241697856 \h </w:instrText>
+              <w:instrText xml:space="preserve"> PAGEREF _Toc241701029 \h </w:instrText>
             </w:r>
             <w:r>
               <w:rPr>
@@ -1069,7 +1069,7 @@
               <w:noProof/>
             </w:rPr>
           </w:pPr>
-          <w:hyperlink w:anchor="_Toc241697857" w:history="1">
+          <w:hyperlink w:anchor="_Toc241701030" w:history="1">
             <w:r>
               <w:rPr>
                 <w:rStyle w:val="Hyperlink"/>
@@ -1093,7 +1093,7 @@
               <w:rPr>
                 <w:noProof/>
               </w:rPr>
-              <w:instrText xml:space="preserve"> PAGEREF _Toc241697857 \h </w:instrText>
+              <w:instrText xml:space="preserve"> PAGEREF _Toc241701030 \h </w:instrText>
             </w:r>
             <w:r>
               <w:rPr>
@@ -1131,7 +1131,7 @@
               <w:noProof/>
             </w:rPr>
           </w:pPr>
-          <w:hyperlink w:anchor="_Toc241697858" w:history="1">
+          <w:hyperlink w:anchor="_Toc241701031" w:history="1">
             <w:r>
               <w:rPr>
                 <w:rStyle w:val="Hyperlink"/>
@@ -1155,7 +1155,7 @@
               <w:rPr>
                 <w:noProof/>
               </w:rPr>
-              <w:instrText xml:space="preserve"> PAGEREF _Toc241697858 \h </w:instrText>
+              <w:instrText xml:space="preserve"> PAGEREF _Toc241701031 \h </w:instrText>
             </w:r>
             <w:r>
               <w:rPr>
@@ -1193,7 +1193,7 @@
               <w:noProof/>
             </w:rPr>
           </w:pPr>
-          <w:hyperlink w:anchor="_Toc241697859" w:history="1">
+          <w:hyperlink w:anchor="_Toc241701032" w:history="1">
             <w:r>
               <w:rPr>
                 <w:rStyle w:val="Hyperlink"/>
@@ -1217,7 +1217,7 @@
               <w:rPr>
                 <w:noProof/>
               </w:rPr>
-              <w:instrText xml:space="preserve"> PAGEREF _Toc241697859 \h </w:instrText>
+              <w:instrText xml:space="preserve"> PAGEREF _Toc241701032 \h </w:instrText>
             </w:r>
             <w:r>
               <w:rPr>
@@ -1255,7 +1255,7 @@
               <w:noProof/>
             </w:rPr>
           </w:pPr>
-          <w:hyperlink w:anchor="_Toc241697860" w:history="1">
+          <w:hyperlink w:anchor="_Toc241701033" w:history="1">
             <w:r>
               <w:rPr>
                 <w:rStyle w:val="Hyperlink"/>
@@ -1279,7 +1279,7 @@
               <w:rPr>
                 <w:noProof/>
               </w:rPr>
-              <w:instrText xml:space="preserve"> PAGEREF _Toc241697860 \h </w:instrText>
+              <w:instrText xml:space="preserve"> PAGEREF _Toc241701033 \h </w:instrText>
             </w:r>
             <w:r>
               <w:rPr>
@@ -1317,7 +1317,7 @@
               <w:noProof/>
             </w:rPr>
           </w:pPr>
-          <w:hyperlink w:anchor="_Toc241697861" w:history="1">
+          <w:hyperlink w:anchor="_Toc241701034" w:history="1">
             <w:r>
               <w:rPr>
                 <w:rStyle w:val="Hyperlink"/>
@@ -1341,7 +1341,7 @@
               <w:rPr>
                 <w:noProof/>
               </w:rPr>
-              <w:instrText xml:space="preserve"> PAGEREF _Toc241697861 \h </w:instrText>
+              <w:instrText xml:space="preserve"> PAGEREF _Toc241701034 \h </w:instrText>
             </w:r>
             <w:r>
               <w:rPr>
@@ -1379,7 +1379,7 @@
               <w:noProof/>
             </w:rPr>
           </w:pPr>
-          <w:hyperlink w:anchor="_Toc241697862" w:history="1">
+          <w:hyperlink w:anchor="_Toc241701035" w:history="1">
             <w:r>
               <w:rPr>
                 <w:rStyle w:val="Hyperlink"/>
@@ -1403,7 +1403,7 @@
               <w:rPr>
                 <w:noProof/>
               </w:rPr>
-              <w:instrText xml:space="preserve"> PAGEREF _Toc241697862 \h </w:instrText>
+              <w:instrText xml:space="preserve"> PAGEREF _Toc241701035 \h </w:instrText>
             </w:r>
             <w:r>
               <w:rPr>
@@ -1441,7 +1441,7 @@
               <w:noProof/>
             </w:rPr>
           </w:pPr>
-          <w:hyperlink w:anchor="_Toc241697863" w:history="1">
+          <w:hyperlink w:anchor="_Toc241701036" w:history="1">
             <w:r>
               <w:rPr>
                 <w:rStyle w:val="Hyperlink"/>
@@ -1465,7 +1465,7 @@
               <w:rPr>
                 <w:noProof/>
               </w:rPr>
-              <w:instrText xml:space="preserve"> PAGEREF _Toc241697863 \h </w:instrText>
+              <w:instrText xml:space="preserve"> PAGEREF _Toc241701036 \h </w:instrText>
             </w:r>
             <w:r>
               <w:rPr>
@@ -1503,7 +1503,7 @@
               <w:noProof/>
             </w:rPr>
           </w:pPr>
-          <w:hyperlink w:anchor="_Toc241697864" w:history="1">
+          <w:hyperlink w:anchor="_Toc241701037" w:history="1">
             <w:r>
               <w:rPr>
                 <w:rStyle w:val="Hyperlink"/>
@@ -1527,7 +1527,7 @@
               <w:rPr>
                 <w:noProof/>
               </w:rPr>
-              <w:instrText xml:space="preserve"> PAGEREF _Toc241697864 \h </w:instrText>
+              <w:instrText xml:space="preserve"> PAGEREF _Toc241701037 \h </w:instrText>
             </w:r>
             <w:r>
               <w:rPr>
@@ -1565,7 +1565,7 @@
               <w:noProof/>
             </w:rPr>
           </w:pPr>
-          <w:hyperlink w:anchor="_Toc241697865" w:history="1">
+          <w:hyperlink w:anchor="_Toc241701038" w:history="1">
             <w:r>
               <w:rPr>
                 <w:rStyle w:val="Hyperlink"/>
@@ -1589,7 +1589,7 @@
               <w:rPr>
                 <w:noProof/>
               </w:rPr>
-              <w:instrText xml:space="preserve"> PAGEREF _Toc241697865 \h </w:instrText>
+              <w:instrText xml:space="preserve"> PAGEREF _Toc241701038 \h </w:instrText>
             </w:r>
             <w:r>
               <w:rPr>
@@ -1627,7 +1627,7 @@
               <w:noProof/>
             </w:rPr>
           </w:pPr>
-          <w:hyperlink w:anchor="_Toc241697866" w:history="1">
+          <w:hyperlink w:anchor="_Toc241701039" w:history="1">
             <w:r>
               <w:rPr>
                 <w:rStyle w:val="Hyperlink"/>
@@ -1651,7 +1651,7 @@
               <w:rPr>
                 <w:noProof/>
               </w:rPr>
-              <w:instrText xml:space="preserve"> PAGEREF _Toc241697866 \h </w:instrText>
+              <w:instrText xml:space="preserve"> PAGEREF _Toc241701039 \h </w:instrText>
             </w:r>
             <w:r>
               <w:rPr>
@@ -1689,7 +1689,7 @@
               <w:noProof/>
             </w:rPr>
           </w:pPr>
-          <w:hyperlink w:anchor="_Toc241697867" w:history="1">
+          <w:hyperlink w:anchor="_Toc241701040" w:history="1">
             <w:r>
               <w:rPr>
                 <w:rStyle w:val="Hyperlink"/>
@@ -1713,7 +1713,7 @@
               <w:rPr>
                 <w:noProof/>
               </w:rPr>
-              <w:instrText xml:space="preserve"> PAGEREF _Toc241697867 \h </w:instrText>
+              <w:instrText xml:space="preserve"> PAGEREF _Toc241701040 \h </w:instrText>
             </w:r>
             <w:r>
               <w:rPr>
@@ -1751,7 +1751,7 @@
               <w:noProof/>
             </w:rPr>
           </w:pPr>
-          <w:hyperlink w:anchor="_Toc241697868" w:history="1">
+          <w:hyperlink w:anchor="_Toc241701041" w:history="1">
             <w:r>
               <w:rPr>
                 <w:rStyle w:val="Hyperlink"/>
@@ -1775,7 +1775,7 @@
               <w:rPr>
                 <w:noProof/>
               </w:rPr>
-              <w:instrText xml:space="preserve"> PAGEREF _Toc241697868 \h </w:instrText>
+              <w:instrText xml:space="preserve"> PAGEREF _Toc241701041 \h </w:instrText>
             </w:r>
             <w:r>
               <w:rPr>
@@ -1813,7 +1813,7 @@
               <w:noProof/>
             </w:rPr>
           </w:pPr>
-          <w:hyperlink w:anchor="_Toc241697869" w:history="1">
+          <w:hyperlink w:anchor="_Toc241701042" w:history="1">
             <w:r>
               <w:rPr>
                 <w:rStyle w:val="Hyperlink"/>
@@ -1837,7 +1837,7 @@
               <w:rPr>
                 <w:noProof/>
               </w:rPr>
-              <w:instrText xml:space="preserve"> PAGEREF _Toc241697869 \h </w:instrText>
+              <w:instrText xml:space="preserve"> PAGEREF _Toc241701042 \h </w:instrText>
             </w:r>
             <w:r>
               <w:rPr>
@@ -1875,7 +1875,7 @@
               <w:noProof/>
             </w:rPr>
           </w:pPr>
-          <w:hyperlink w:anchor="_Toc241697870" w:history="1">
+          <w:hyperlink w:anchor="_Toc241701043" w:history="1">
             <w:r>
               <w:rPr>
                 <w:rStyle w:val="Hyperlink"/>
@@ -1899,7 +1899,7 @@
               <w:rPr>
                 <w:noProof/>
               </w:rPr>
-              <w:instrText xml:space="preserve"> PAGEREF _Toc241697870 \h </w:instrText>
+              <w:instrText xml:space="preserve"> PAGEREF _Toc241701043 \h </w:instrText>
             </w:r>
             <w:r>
               <w:rPr>
@@ -1944,7 +1944,7 @@
         <w:keepNext/>
         <w:keepLines/>
       </w:pPr>
-      <w:bookmarkStart w:id="1" w:name="_Toc241697842"/>
+      <w:bookmarkStart w:id="1" w:name="_Toc241701015"/>
       <w:r>
         <w:lastRenderedPageBreak/>
         <w:t>Project Metadata and Team Information</w:t>
@@ -3293,7 +3293,7 @@
         <w:keepNext/>
         <w:keepLines/>
       </w:pPr>
-      <w:bookmarkStart w:id="2" w:name="_Toc241697843"/>
+      <w:bookmarkStart w:id="2" w:name="_Toc241701016"/>
       <w:r>
         <w:t>Abstract</w:t>
       </w:r>
@@ -3382,7 +3382,7 @@
         <w:keepNext/>
         <w:keepLines/>
       </w:pPr>
-      <w:bookmarkStart w:id="3" w:name="_Toc241697844"/>
+      <w:bookmarkStart w:id="3" w:name="_Toc241701017"/>
       <w:r>
         <w:lastRenderedPageBreak/>
         <w:t>1. Progress Against the Milestone 3 Plan</w:t>
@@ -4273,7 +4273,7 @@
         <w:keepNext/>
         <w:keepLines/>
       </w:pPr>
-      <w:bookmarkStart w:id="4" w:name="_Toc241697845"/>
+      <w:bookmarkStart w:id="4" w:name="_Toc241701018"/>
       <w:r>
         <w:t>2. System Architecture</w:t>
       </w:r>
@@ -4317,7 +4317,7 @@
         <w:keepNext/>
         <w:keepLines/>
       </w:pPr>
-      <w:bookmarkStart w:id="5" w:name="_Toc241697846"/>
+      <w:bookmarkStart w:id="5" w:name="_Toc241701019"/>
       <w:r>
         <w:t>2.1 Scene perception</w:t>
       </w:r>
@@ -4485,7 +4485,7 @@
         <w:keepNext/>
         <w:keepLines/>
       </w:pPr>
-      <w:bookmarkStart w:id="6" w:name="_Toc241697847"/>
+      <w:bookmarkStart w:id="6" w:name="_Toc241701020"/>
       <w:r>
         <w:t>2.2 From bus to ledger</w:t>
       </w:r>
@@ -4513,7 +4513,7 @@
         <w:keepNext/>
         <w:keepLines/>
       </w:pPr>
-      <w:bookmarkStart w:id="7" w:name="_Toc241697848"/>
+      <w:bookmarkStart w:id="7" w:name="_Toc241701021"/>
       <w:r>
         <w:t>3. Datasets and Data Hygiene</w:t>
       </w:r>
@@ -5514,7 +5514,7 @@
         <w:keepNext/>
         <w:keepLines/>
       </w:pPr>
-      <w:bookmarkStart w:id="8" w:name="_Toc241697849"/>
+      <w:bookmarkStart w:id="8" w:name="_Toc241701022"/>
       <w:r>
         <w:t>3.1 A leakage finding in CDSet</w:t>
       </w:r>
@@ -5548,7 +5548,7 @@
         <w:keepNext/>
         <w:keepLines/>
       </w:pPr>
-      <w:bookmarkStart w:id="9" w:name="_Toc241697850"/>
+      <w:bookmarkStart w:id="9" w:name="_Toc241701023"/>
       <w:r>
         <w:t>3.2 Synthetic data in the plate dataset</w:t>
       </w:r>
@@ -5572,7 +5572,7 @@
         <w:keepNext/>
         <w:keepLines/>
       </w:pPr>
-      <w:bookmarkStart w:id="10" w:name="_Toc241697851"/>
+      <w:bookmarkStart w:id="10" w:name="_Toc241701024"/>
       <w:r>
         <w:t>4. Methods</w:t>
       </w:r>
@@ -5584,7 +5584,7 @@
         <w:keepNext/>
         <w:keepLines/>
       </w:pPr>
-      <w:bookmarkStart w:id="11" w:name="_Toc241697852"/>
+      <w:bookmarkStart w:id="11" w:name="_Toc241701025"/>
       <w:r>
         <w:t>4.1 Detector training protoco</w:t>
       </w:r>
@@ -5634,7 +5634,7 @@
         <w:keepNext/>
         <w:keepLines/>
       </w:pPr>
-      <w:bookmarkStart w:id="12" w:name="_Toc241697853"/>
+      <w:bookmarkStart w:id="12" w:name="_Toc241701026"/>
       <w:r>
         <w:lastRenderedPageBreak/>
         <w:t>4.2 Frame-quali</w:t>
@@ -5672,7 +5672,7 @@
         <w:keepNext/>
         <w:keepLines/>
       </w:pPr>
-      <w:bookmarkStart w:id="13" w:name="_Toc241697854"/>
+      <w:bookmarkStart w:id="13" w:name="_Toc241701027"/>
       <w:r>
         <w:t>4.3 IMU band-pass filter</w:t>
       </w:r>
@@ -5693,7 +5693,7 @@
         <w:keepNext/>
         <w:keepLines/>
       </w:pPr>
-      <w:bookmarkStart w:id="14" w:name="_Toc241697855"/>
+      <w:bookmarkStart w:id="14" w:name="_Toc241701028"/>
       <w:r>
         <w:t>4.4 Privacy redactio</w:t>
       </w:r>
@@ -5720,7 +5720,7 @@
         <w:keepNext/>
         <w:keepLines/>
       </w:pPr>
-      <w:bookmarkStart w:id="15" w:name="_Toc241697856"/>
+      <w:bookmarkStart w:id="15" w:name="_Toc241701029"/>
       <w:r>
         <w:t>4.5 Edge event packet</w:t>
       </w:r>
@@ -5747,7 +5747,7 @@
         <w:keepNext/>
         <w:keepLines/>
       </w:pPr>
-      <w:bookmarkStart w:id="16" w:name="_Toc241697857"/>
+      <w:bookmarkStart w:id="16" w:name="_Toc241701030"/>
       <w:r>
         <w:t>4.6 Repair Priority Index</w:t>
       </w:r>
@@ -5799,7 +5799,7 @@
         <w:keepNext/>
         <w:keepLines/>
       </w:pPr>
-      <w:bookmarkStart w:id="17" w:name="_Toc241697858"/>
+      <w:bookmarkStart w:id="17" w:name="_Toc241701031"/>
       <w:r>
         <w:t>4.7 INT8 quantization</w:t>
       </w:r>
@@ -5826,7 +5826,7 @@
         <w:keepNext/>
         <w:keepLines/>
       </w:pPr>
-      <w:bookmarkStart w:id="18" w:name="_Toc241697859"/>
+      <w:bookmarkStart w:id="18" w:name="_Toc241701032"/>
       <w:r>
         <w:lastRenderedPageBreak/>
         <w:t>5. Results</w:t>
@@ -5848,7 +5848,7 @@
         <w:keepNext/>
         <w:keepLines/>
       </w:pPr>
-      <w:bookmarkStart w:id="19" w:name="_Toc241697860"/>
+      <w:bookmarkStart w:id="19" w:name="_Toc241701033"/>
       <w:r>
         <w:t>5.1 Zebra-cros</w:t>
       </w:r>
@@ -7181,7 +7181,7 @@
         <w:keepNext/>
         <w:keepLines/>
       </w:pPr>
-      <w:bookmarkStart w:id="20" w:name="_Toc241697861"/>
+      <w:bookmarkStart w:id="20" w:name="_Toc241701034"/>
       <w:r>
         <w:t>5.2 Road-damage detector</w:t>
       </w:r>
@@ -8104,7 +8104,7 @@
         <w:keepNext/>
         <w:keepLines/>
       </w:pPr>
-      <w:bookmarkStart w:id="21" w:name="_Toc241697862"/>
+      <w:bookmarkStart w:id="21" w:name="_Toc241701035"/>
       <w:r>
         <w:t>5.3 IMU band-pass filter</w:t>
       </w:r>
@@ -8554,7 +8554,7 @@
         <w:keepNext/>
         <w:keepLines/>
       </w:pPr>
-      <w:bookmarkStart w:id="22" w:name="_Toc241697863"/>
+      <w:bookmarkStart w:id="22" w:name="_Toc241701036"/>
       <w:r>
         <w:lastRenderedPageBreak/>
         <w:t>5.4 Frame-quality gate</w:t>
@@ -9092,7 +9092,7 @@
         <w:keepNext/>
         <w:keepLines/>
       </w:pPr>
-      <w:bookmarkStart w:id="23" w:name="_Toc241697864"/>
+      <w:bookmarkStart w:id="23" w:name="_Toc241701037"/>
       <w:r>
         <w:t>5.5 INT8 quantization</w:t>
       </w:r>
@@ -9520,7 +9520,17 @@
           <w:sz w:val="18"/>
           <w:szCs w:val="18"/>
         </w:rPr>
-        <w:t>Table 10. INT8 results (percentile calibration). The detector loses almost nothing; the classifier loses 2.6 points, so full precision remains the default and INT8 is offered for low-power edge boards.</w:t>
+        <w:t>Table 10. INT8 results (percentile calibration). The detector loses almost nothing; the classifier loses 2.6 points, so full precision remains the default and INT8 is offered for low-power edge boards. The classifier figure</w:t>
+      </w:r>
+      <w:r>
+        <w:rPr>
+          <w:i/>
+          <w:iCs/>
+          <w:color w:val="555555"/>
+          <w:sz w:val="18"/>
+          <w:szCs w:val="18"/>
+        </w:rPr>
+        <w:t>s compare FP32 and INT8 on identical images; because the DNIT crops were regenerated, that image set is not exactly the published held-out split, so the absolute 93.4% is not comparable to the published 90.1% — the 2.6-point difference is the measurement.</w:t>
       </w:r>
     </w:p>
     <w:p>
@@ -9529,7 +9539,7 @@
         <w:keepNext/>
         <w:keepLines/>
       </w:pPr>
-      <w:bookmarkStart w:id="24" w:name="_Toc241697865"/>
+      <w:bookmarkStart w:id="24" w:name="_Toc241701038"/>
       <w:r>
         <w:t>5.6 Latency</w:t>
       </w:r>
@@ -9541,10 +9551,7 @@
         <w:jc w:val="both"/>
       </w:pPr>
       <w:r>
-        <w:t>On a 1280</w:t>
-      </w:r>
-      <w:r>
-        <w:t xml:space="preserve">×720 frame (laptop CPU, median of 15 runs): COCO traffic detector 202 ms, crossing detector 76 ms, both together 276 ms; classifier backbone 21 ms. The three-detector total is </w:t>
+        <w:t xml:space="preserve">On a 1280×720 frame (laptop CPU, median of 15 runs): COCO traffic detector 202 ms, crossing detector 76 ms, both together 276 ms; classifier backbone 21 ms. The three-detector total is </w:t>
       </w:r>
       <w:r>
         <w:rPr>
@@ -9565,9 +9572,12 @@
         <w:keepNext/>
         <w:keepLines/>
       </w:pPr>
-      <w:bookmarkStart w:id="25" w:name="_Toc241697866"/>
-      <w:r>
-        <w:t>6. Corrections to the Milestone 2 Report</w:t>
+      <w:bookmarkStart w:id="25" w:name="_Toc241701039"/>
+      <w:r>
+        <w:t>6. Corrections to the Milest</w:t>
+      </w:r>
+      <w:r>
+        <w:t>one 2 Report</w:t>
       </w:r>
       <w:bookmarkEnd w:id="25"/>
     </w:p>
@@ -9577,10 +9587,7 @@
         <w:jc w:val="both"/>
       </w:pPr>
       <w:r>
-        <w:t>Checking</w:t>
-      </w:r>
-      <w:r>
-        <w:t xml:space="preserve"> each Milestone 2 claim against the code and measurements produced the following corrections. We report them in the same spirit as Milestone 2's disclosure on macro-F1: a number that cannot be reproduced should not be cited.</w:t>
+        <w:t>Checking each Milestone 2 claim against the code and measurements produced the following corrections. We report them in the same spirit as Milestone 2's disclosure on macro-F1: a number that cannot be reproduced should not be cited.</w:t>
       </w:r>
     </w:p>
     <w:tbl>
@@ -10556,6 +10563,7 @@
                 <w:sz w:val="18"/>
                 <w:szCs w:val="18"/>
               </w:rPr>
+              <w:lastRenderedPageBreak/>
               <w:t>C10</w:t>
             </w:r>
           </w:p>
@@ -10645,7 +10653,6 @@
                 <w:sz w:val="18"/>
                 <w:szCs w:val="18"/>
               </w:rPr>
-              <w:lastRenderedPageBreak/>
               <w:t>C11</w:t>
             </w:r>
           </w:p>
@@ -10735,7 +10742,7 @@
         <w:keepNext/>
         <w:keepLines/>
       </w:pPr>
-      <w:bookmarkStart w:id="26" w:name="_Toc241697867"/>
+      <w:bookmarkStart w:id="26" w:name="_Toc241701040"/>
       <w:r>
         <w:t>7. Software Engineering and Security</w:t>
       </w:r>
@@ -10860,7 +10867,7 @@
         <w:keepNext/>
         <w:keepLines/>
       </w:pPr>
-      <w:bookmarkStart w:id="27" w:name="_Toc241697868"/>
+      <w:bookmarkStart w:id="27" w:name="_Toc241701041"/>
       <w:r>
         <w:t>8. Limitations and Ethical Considerations</w:t>
       </w:r>
@@ -10959,7 +10966,7 @@
         <w:keepNext/>
         <w:keepLines/>
       </w:pPr>
-      <w:bookmarkStart w:id="28" w:name="_Toc241697869"/>
+      <w:bookmarkStart w:id="28" w:name="_Toc241701042"/>
       <w:r>
         <w:t>9. Next Steps</w:t>
       </w:r>
@@ -11051,7 +11058,7 @@
         <w:keepNext/>
         <w:keepLines/>
       </w:pPr>
-      <w:bookmarkStart w:id="29" w:name="_Toc241697870"/>
+      <w:bookmarkStart w:id="29" w:name="_Toc241701043"/>
       <w:r>
         <w:lastRenderedPageBreak/>
         <w:t>References</w:t>
@@ -11340,10 +11347,10 @@
 <file path=word/numbering.xml><?xml version="1.0" encoding="utf-8"?>
 <w:numbering xmlns:wpc="http://schemas.microsoft.com/office/word/2010/wordprocessingCanvas" xmlns:cx="http://schemas.microsoft.com/office/drawing/2014/chartex" xmlns:mc="http://schemas.openxmlformats.org/markup-compatibility/2006" xmlns:o="urn:schemas-microsoft-com:office:office" xmlns:r="http://schemas.openxmlformats.org/officeDocument/2006/relationships" xmlns:m="http://schemas.openxmlformats.org/officeDocument/2006/math" xmlns:v="urn:schemas-microsoft-com:vml" xmlns:wp14="http://schemas.microsoft.com/office/word/2010/wordprocessingDrawing" xmlns:wp="http://schemas.openxmlformats.org/drawingml/2006/wordprocessingDrawing" xmlns:w10="urn:schemas-microsoft-com:office:word" xmlns:w="http://schemas.openxmlformats.org/wordprocessingml/2006/main" xmlns:w14="http://schemas.microsoft.com/office/word/2010/wordml" xmlns:w15="http://schemas.microsoft.com/office/word/2012/wordml" xmlns:w16se="http://schemas.microsoft.com/office/word/2015/wordml/symex" xmlns:wpg="http://schemas.microsoft.com/office/word/2010/wordprocessingGroup" xmlns:wpi="http://schemas.microsoft.com/office/word/2010/wordprocessingInk" xmlns:wne="http://schemas.microsoft.com/office/word/2006/wordml" xmlns:wps="http://schemas.microsoft.com/office/word/2010/wordprocessingShape" mc:Ignorable="w14 w15 w16se wp14">
   <w:abstractNum w:abstractNumId="0" w15:restartNumberingAfterBreak="0">
-    <w:nsid w:val="1D94603D"/>
+    <w:nsid w:val="079517F6"/>
     <w:multiLevelType w:val="hybridMultilevel"/>
-    <w:tmpl w:val="96CE0600"/>
-    <w:lvl w:ilvl="0" w:tplc="9AE83308" w:tentative="1">
+    <w:tmpl w:val="F54E4620"/>
+    <w:lvl w:ilvl="0" w:tplc="C30630C2" w:tentative="1">
       <w:start w:val="1"/>
       <w:numFmt w:val="bullet"/>
       <w:lvlText w:val="●"/>
@@ -11352,7 +11359,7 @@
         <w:ind w:left="720" w:hanging="360"/>
       </w:pPr>
     </w:lvl>
-    <w:lvl w:ilvl="1" w:tplc="2CB80ADC" w:tentative="1">
+    <w:lvl w:ilvl="1" w:tplc="EBCED22A" w:tentative="1">
       <w:start w:val="1"/>
       <w:numFmt w:val="bullet"/>
       <w:lvlText w:val="○"/>
@@ -11361,7 +11368,7 @@
         <w:ind w:left="1440" w:hanging="360"/>
       </w:pPr>
     </w:lvl>
-    <w:lvl w:ilvl="2" w:tplc="E95E7664" w:tentative="1">
+    <w:lvl w:ilvl="2" w:tplc="0FC8B290" w:tentative="1">
       <w:start w:val="1"/>
       <w:numFmt w:val="bullet"/>
       <w:lvlText w:val="■"/>
@@ -11370,7 +11377,7 @@
         <w:ind w:left="2160" w:hanging="360"/>
       </w:pPr>
     </w:lvl>
-    <w:lvl w:ilvl="3" w:tplc="6F7AF2FA" w:tentative="1">
+    <w:lvl w:ilvl="3" w:tplc="E5022DBA" w:tentative="1">
       <w:start w:val="1"/>
       <w:numFmt w:val="bullet"/>
       <w:lvlText w:val="●"/>
@@ -11379,7 +11386,7 @@
         <w:ind w:left="2880" w:hanging="360"/>
       </w:pPr>
     </w:lvl>
-    <w:lvl w:ilvl="4" w:tplc="289AE9E2" w:tentative="1">
+    <w:lvl w:ilvl="4" w:tplc="C13A4B32" w:tentative="1">
       <w:start w:val="1"/>
       <w:numFmt w:val="bullet"/>
       <w:lvlText w:val="○"/>
@@ -11388,7 +11395,7 @@
         <w:ind w:left="3600" w:hanging="360"/>
       </w:pPr>
     </w:lvl>
-    <w:lvl w:ilvl="5" w:tplc="3B06AC52" w:tentative="1">
+    <w:lvl w:ilvl="5" w:tplc="13B0A240" w:tentative="1">
       <w:start w:val="1"/>
       <w:numFmt w:val="bullet"/>
       <w:lvlText w:val="■"/>
@@ -11397,7 +11404,7 @@
         <w:ind w:left="4320" w:hanging="360"/>
       </w:pPr>
     </w:lvl>
-    <w:lvl w:ilvl="6" w:tplc="65CA5290" w:tentative="1">
+    <w:lvl w:ilvl="6" w:tplc="D8D8561E" w:tentative="1">
       <w:start w:val="1"/>
       <w:numFmt w:val="bullet"/>
       <w:lvlText w:val="●"/>
@@ -11406,7 +11413,7 @@
         <w:ind w:left="5040" w:hanging="360"/>
       </w:pPr>
     </w:lvl>
-    <w:lvl w:ilvl="7" w:tplc="E24062EA" w:tentative="1">
+    <w:lvl w:ilvl="7" w:tplc="550AE472" w:tentative="1">
       <w:start w:val="1"/>
       <w:numFmt w:val="bullet"/>
       <w:lvlText w:val="●"/>
@@ -11415,7 +11422,7 @@
         <w:ind w:left="5760" w:hanging="360"/>
       </w:pPr>
     </w:lvl>
-    <w:lvl w:ilvl="8" w:tplc="1070DEA0" w:tentative="1">
+    <w:lvl w:ilvl="8" w:tplc="8708E1FE" w:tentative="1">
       <w:start w:val="1"/>
       <w:numFmt w:val="bullet"/>
       <w:lvlText w:val="●"/>
@@ -11426,10 +11433,10 @@
     </w:lvl>
   </w:abstractNum>
   <w:abstractNum w:abstractNumId="1" w15:restartNumberingAfterBreak="0">
-    <w:nsid w:val="2B6F0C61"/>
+    <w:nsid w:val="39581E94"/>
     <w:multiLevelType w:val="hybridMultilevel"/>
-    <w:tmpl w:val="24369F74"/>
-    <w:lvl w:ilvl="0" w:tplc="C19C001C">
+    <w:tmpl w:val="B4720B76"/>
+    <w:lvl w:ilvl="0" w:tplc="29BEBEA6">
       <w:start w:val="1"/>
       <w:numFmt w:val="bullet"/>
       <w:lvlText w:val="•"/>
@@ -11438,42 +11445,42 @@
         <w:ind w:left="540" w:hanging="270"/>
       </w:pPr>
     </w:lvl>
-    <w:lvl w:ilvl="1" w:tplc="7F985142">
+    <w:lvl w:ilvl="1" w:tplc="75F0D520">
       <w:numFmt w:val="decimal"/>
       <w:lvlText w:val=""/>
       <w:lvlJc w:val="left"/>
     </w:lvl>
-    <w:lvl w:ilvl="2" w:tplc="EA1AA7EC">
+    <w:lvl w:ilvl="2" w:tplc="AC34DFBC">
       <w:numFmt w:val="decimal"/>
       <w:lvlText w:val=""/>
       <w:lvlJc w:val="left"/>
     </w:lvl>
-    <w:lvl w:ilvl="3" w:tplc="A908390A">
+    <w:lvl w:ilvl="3" w:tplc="C7A23EB8">
       <w:numFmt w:val="decimal"/>
       <w:lvlText w:val=""/>
       <w:lvlJc w:val="left"/>
     </w:lvl>
-    <w:lvl w:ilvl="4" w:tplc="7DF822E6">
+    <w:lvl w:ilvl="4" w:tplc="941C7728">
       <w:numFmt w:val="decimal"/>
       <w:lvlText w:val=""/>
       <w:lvlJc w:val="left"/>
     </w:lvl>
-    <w:lvl w:ilvl="5" w:tplc="29C0217E">
+    <w:lvl w:ilvl="5" w:tplc="AE4ABF72">
       <w:numFmt w:val="decimal"/>
       <w:lvlText w:val=""/>
       <w:lvlJc w:val="left"/>
     </w:lvl>
-    <w:lvl w:ilvl="6" w:tplc="5B147FB0">
+    <w:lvl w:ilvl="6" w:tplc="2CBC7516">
       <w:numFmt w:val="decimal"/>
       <w:lvlText w:val=""/>
       <w:lvlJc w:val="left"/>
     </w:lvl>
-    <w:lvl w:ilvl="7" w:tplc="17BE26E4">
+    <w:lvl w:ilvl="7" w:tplc="2D104B78">
       <w:numFmt w:val="decimal"/>
       <w:lvlText w:val=""/>
       <w:lvlJc w:val="left"/>
     </w:lvl>
-    <w:lvl w:ilvl="8" w:tplc="77D81AF8">
+    <w:lvl w:ilvl="8" w:tplc="BCF0CD56">
       <w:numFmt w:val="decimal"/>
       <w:lvlText w:val=""/>
       <w:lvlJc w:val="left"/>
@@ -12102,7 +12109,7 @@
     <w:autoRedefine/>
     <w:uiPriority w:val="39"/>
     <w:unhideWhenUsed/>
-    <w:rsid w:val="000A6E40"/>
+    <w:rsid w:val="004F5E15"/>
     <w:pPr>
       <w:spacing w:after="100"/>
     </w:pPr>
@@ -12114,7 +12121,7 @@
     <w:autoRedefine/>
     <w:uiPriority w:val="39"/>
     <w:unhideWhenUsed/>
-    <w:rsid w:val="000A6E40"/>
+    <w:rsid w:val="004F5E15"/>
     <w:pPr>
       <w:spacing w:after="100"/>
       <w:ind w:left="220"/>

</xml_diff>